<commit_message>
docs: se agregan al informe de requisitos las conclusiones
</commit_message>
<xml_diff>
--- a/informe_requisitos.docx
+++ b/informe_requisitos.docx
@@ -584,7 +584,7 @@
           <w:rFonts w:hint="default"/>
           <w:lang w:val="es-CO"/>
         </w:rPr>
-        <w:instrText xml:space="preserve"> HYPERLINK \l _Toc4788 </w:instrText>
+        <w:instrText xml:space="preserve"> HYPERLINK \l _Toc2346 </w:instrText>
       </w:r>
       <w:r>
         <w:rPr>
@@ -607,7 +607,7 @@
         <w:fldChar w:fldCharType="begin"/>
       </w:r>
       <w:r>
-        <w:instrText xml:space="preserve"> PAGEREF _Toc4788 \h </w:instrText>
+        <w:instrText xml:space="preserve"> PAGEREF _Toc2346 \h </w:instrText>
       </w:r>
       <w:r>
         <w:fldChar w:fldCharType="separate"/>
@@ -646,7 +646,7 @@
           <w:rFonts w:hint="default"/>
           <w:lang w:val="es-CO"/>
         </w:rPr>
-        <w:instrText xml:space="preserve"> HYPERLINK \l _Toc9946 </w:instrText>
+        <w:instrText xml:space="preserve"> HYPERLINK \l _Toc11550 </w:instrText>
       </w:r>
       <w:r>
         <w:rPr>
@@ -669,7 +669,7 @@
         <w:fldChar w:fldCharType="begin"/>
       </w:r>
       <w:r>
-        <w:instrText xml:space="preserve"> PAGEREF _Toc9946 \h </w:instrText>
+        <w:instrText xml:space="preserve"> PAGEREF _Toc11550 \h </w:instrText>
       </w:r>
       <w:r>
         <w:fldChar w:fldCharType="separate"/>
@@ -708,7 +708,7 @@
           <w:rFonts w:hint="default"/>
           <w:lang w:val="es-CO"/>
         </w:rPr>
-        <w:instrText xml:space="preserve"> HYPERLINK \l _Toc18551 </w:instrText>
+        <w:instrText xml:space="preserve"> HYPERLINK \l _Toc11642 </w:instrText>
       </w:r>
       <w:r>
         <w:rPr>
@@ -731,7 +731,7 @@
         <w:fldChar w:fldCharType="begin"/>
       </w:r>
       <w:r>
-        <w:instrText xml:space="preserve"> PAGEREF _Toc18551 \h </w:instrText>
+        <w:instrText xml:space="preserve"> PAGEREF _Toc11642 \h </w:instrText>
       </w:r>
       <w:r>
         <w:fldChar w:fldCharType="separate"/>
@@ -770,7 +770,7 @@
           <w:rFonts w:hint="default"/>
           <w:lang w:val="es-CO"/>
         </w:rPr>
-        <w:instrText xml:space="preserve"> HYPERLINK \l _Toc18466 </w:instrText>
+        <w:instrText xml:space="preserve"> HYPERLINK \l _Toc4974 </w:instrText>
       </w:r>
       <w:r>
         <w:rPr>
@@ -793,7 +793,7 @@
         <w:fldChar w:fldCharType="begin"/>
       </w:r>
       <w:r>
-        <w:instrText xml:space="preserve"> PAGEREF _Toc18466 \h </w:instrText>
+        <w:instrText xml:space="preserve"> PAGEREF _Toc4974 \h </w:instrText>
       </w:r>
       <w:r>
         <w:fldChar w:fldCharType="separate"/>
@@ -832,7 +832,7 @@
           <w:rFonts w:hint="default"/>
           <w:lang w:val="es-CO"/>
         </w:rPr>
-        <w:instrText xml:space="preserve"> HYPERLINK \l _Toc24463 </w:instrText>
+        <w:instrText xml:space="preserve"> HYPERLINK \l _Toc26980 </w:instrText>
       </w:r>
       <w:r>
         <w:rPr>
@@ -855,7 +855,7 @@
         <w:fldChar w:fldCharType="begin"/>
       </w:r>
       <w:r>
-        <w:instrText xml:space="preserve"> PAGEREF _Toc24463 \h </w:instrText>
+        <w:instrText xml:space="preserve"> PAGEREF _Toc26980 \h </w:instrText>
       </w:r>
       <w:r>
         <w:fldChar w:fldCharType="separate"/>
@@ -894,7 +894,7 @@
           <w:rFonts w:hint="default"/>
           <w:lang w:val="es-CO"/>
         </w:rPr>
-        <w:instrText xml:space="preserve"> HYPERLINK \l _Toc18986 </w:instrText>
+        <w:instrText xml:space="preserve"> HYPERLINK \l _Toc22850 </w:instrText>
       </w:r>
       <w:r>
         <w:rPr>
@@ -917,7 +917,7 @@
         <w:fldChar w:fldCharType="begin"/>
       </w:r>
       <w:r>
-        <w:instrText xml:space="preserve"> PAGEREF _Toc18986 \h </w:instrText>
+        <w:instrText xml:space="preserve"> PAGEREF _Toc22850 \h </w:instrText>
       </w:r>
       <w:r>
         <w:fldChar w:fldCharType="separate"/>
@@ -956,7 +956,7 @@
           <w:rFonts w:hint="default"/>
           <w:lang w:val="es-CO"/>
         </w:rPr>
-        <w:instrText xml:space="preserve"> HYPERLINK \l _Toc23332 </w:instrText>
+        <w:instrText xml:space="preserve"> HYPERLINK \l _Toc22747 </w:instrText>
       </w:r>
       <w:r>
         <w:rPr>
@@ -979,7 +979,7 @@
         <w:fldChar w:fldCharType="begin"/>
       </w:r>
       <w:r>
-        <w:instrText xml:space="preserve"> PAGEREF _Toc23332 \h </w:instrText>
+        <w:instrText xml:space="preserve"> PAGEREF _Toc22747 \h </w:instrText>
       </w:r>
       <w:r>
         <w:fldChar w:fldCharType="separate"/>
@@ -1018,7 +1018,7 @@
           <w:rFonts w:hint="default"/>
           <w:lang w:val="es-CO"/>
         </w:rPr>
-        <w:instrText xml:space="preserve"> HYPERLINK \l _Toc19336 </w:instrText>
+        <w:instrText xml:space="preserve"> HYPERLINK \l _Toc16161 </w:instrText>
       </w:r>
       <w:r>
         <w:rPr>
@@ -1041,7 +1041,7 @@
         <w:fldChar w:fldCharType="begin"/>
       </w:r>
       <w:r>
-        <w:instrText xml:space="preserve"> PAGEREF _Toc19336 \h </w:instrText>
+        <w:instrText xml:space="preserve"> PAGEREF _Toc16161 \h </w:instrText>
       </w:r>
       <w:r>
         <w:fldChar w:fldCharType="separate"/>
@@ -1080,7 +1080,7 @@
           <w:rFonts w:hint="default"/>
           <w:lang w:val="es-CO"/>
         </w:rPr>
-        <w:instrText xml:space="preserve"> HYPERLINK \l _Toc3923 </w:instrText>
+        <w:instrText xml:space="preserve"> HYPERLINK \l _Toc9485 </w:instrText>
       </w:r>
       <w:r>
         <w:rPr>
@@ -1103,7 +1103,7 @@
         <w:fldChar w:fldCharType="begin"/>
       </w:r>
       <w:r>
-        <w:instrText xml:space="preserve"> PAGEREF _Toc3923 \h </w:instrText>
+        <w:instrText xml:space="preserve"> PAGEREF _Toc9485 \h </w:instrText>
       </w:r>
       <w:r>
         <w:fldChar w:fldCharType="separate"/>
@@ -1142,7 +1142,7 @@
           <w:rFonts w:hint="default"/>
           <w:lang w:val="es-CO"/>
         </w:rPr>
-        <w:instrText xml:space="preserve"> HYPERLINK \l _Toc18492 </w:instrText>
+        <w:instrText xml:space="preserve"> HYPERLINK \l _Toc4421 </w:instrText>
       </w:r>
       <w:r>
         <w:rPr>
@@ -1165,7 +1165,7 @@
         <w:fldChar w:fldCharType="begin"/>
       </w:r>
       <w:r>
-        <w:instrText xml:space="preserve"> PAGEREF _Toc18492 \h </w:instrText>
+        <w:instrText xml:space="preserve"> PAGEREF _Toc4421 \h </w:instrText>
       </w:r>
       <w:r>
         <w:fldChar w:fldCharType="separate"/>
@@ -1214,8 +1214,6 @@
         </w:rPr>
         <w:br w:type="page"/>
       </w:r>
-      <w:bookmarkStart w:id="10" w:name="_GoBack"/>
-      <w:bookmarkEnd w:id="10"/>
     </w:p>
     <w:p>
       <w:pPr>
@@ -1226,7 +1224,7 @@
           <w:lang w:val="es-CO"/>
         </w:rPr>
       </w:pPr>
-      <w:bookmarkStart w:id="0" w:name="_Toc4788"/>
+      <w:bookmarkStart w:id="0" w:name="_Toc2346"/>
       <w:r>
         <w:rPr>
           <w:rFonts w:hint="default"/>
@@ -1484,7 +1482,7 @@
           <w:lang w:val="es-CO"/>
         </w:rPr>
       </w:pPr>
-      <w:bookmarkStart w:id="1" w:name="_Toc9946"/>
+      <w:bookmarkStart w:id="1" w:name="_Toc11550"/>
       <w:r>
         <w:rPr>
           <w:rFonts w:hint="default"/>
@@ -1620,7 +1618,7 @@
           <w:lang w:val="es-CO"/>
         </w:rPr>
       </w:pPr>
-      <w:bookmarkStart w:id="2" w:name="_Toc18551"/>
+      <w:bookmarkStart w:id="2" w:name="_Toc11642"/>
       <w:r>
         <w:rPr>
           <w:rFonts w:hint="default"/>
@@ -2136,7 +2134,7 @@
           <w:lang w:val="es-CO"/>
         </w:rPr>
       </w:pPr>
-      <w:bookmarkStart w:id="3" w:name="_Toc18466"/>
+      <w:bookmarkStart w:id="3" w:name="_Toc4974"/>
       <w:r>
         <w:rPr>
           <w:rFonts w:hint="default"/>
@@ -2326,7 +2324,7 @@
           <w:lang w:val="es-CO"/>
         </w:rPr>
       </w:pPr>
-      <w:bookmarkStart w:id="4" w:name="_Toc24463"/>
+      <w:bookmarkStart w:id="4" w:name="_Toc26980"/>
       <w:r>
         <w:rPr>
           <w:rFonts w:hint="default"/>
@@ -2925,7 +2923,7 @@
           <w:lang w:val="es-CO"/>
         </w:rPr>
       </w:pPr>
-      <w:bookmarkStart w:id="5" w:name="_Toc18986"/>
+      <w:bookmarkStart w:id="5" w:name="_Toc22850"/>
       <w:r>
         <w:rPr>
           <w:rFonts w:hint="default"/>
@@ -3538,7 +3536,7 @@
           <w:lang w:val="es-CO"/>
         </w:rPr>
       </w:pPr>
-      <w:bookmarkStart w:id="6" w:name="_Toc23332"/>
+      <w:bookmarkStart w:id="6" w:name="_Toc22747"/>
       <w:r>
         <w:rPr>
           <w:rFonts w:hint="default"/>
@@ -3658,7 +3656,7 @@
           <w:lang w:val="es-CO"/>
         </w:rPr>
       </w:pPr>
-      <w:bookmarkStart w:id="7" w:name="_Toc19336"/>
+      <w:bookmarkStart w:id="7" w:name="_Toc16161"/>
       <w:r>
         <w:rPr>
           <w:rFonts w:hint="default"/>
@@ -3675,6 +3673,567 @@
           <w:lang w:val="es-CO"/>
         </w:rPr>
       </w:pPr>
+    </w:p>
+    <w:p>
+      <w:pPr>
+        <w:rPr>
+          <w:rFonts w:hint="default"/>
+          <w:lang w:val="es-CO"/>
+        </w:rPr>
+      </w:pPr>
+    </w:p>
+    <w:p>
+      <w:pPr>
+        <w:rPr>
+          <w:rFonts w:hint="default"/>
+          <w:lang w:val="es-CO"/>
+        </w:rPr>
+      </w:pPr>
+    </w:p>
+    <w:p>
+      <w:pPr>
+        <w:rPr>
+          <w:rFonts w:hint="default"/>
+          <w:lang w:val="es-CO"/>
+        </w:rPr>
+      </w:pPr>
+    </w:p>
+    <w:p>
+      <w:pPr>
+        <w:keepNext w:val="0"/>
+        <w:keepLines w:val="0"/>
+        <w:pageBreakBefore w:val="0"/>
+        <w:widowControl/>
+        <w:numPr>
+          <w:ilvl w:val="0"/>
+          <w:numId w:val="4"/>
+        </w:numPr>
+        <w:kinsoku/>
+        <w:wordWrap/>
+        <w:overflowPunct/>
+        <w:topLinePunct w:val="0"/>
+        <w:autoSpaceDE/>
+        <w:autoSpaceDN/>
+        <w:bidi w:val="0"/>
+        <w:adjustRightInd/>
+        <w:snapToGrid/>
+        <w:ind w:left="425" w:leftChars="0" w:firstLine="720" w:firstLineChars="0"/>
+        <w:textAlignment w:val="auto"/>
+        <w:rPr>
+          <w:rFonts w:hint="default"/>
+          <w:lang w:val="es-CO"/>
+        </w:rPr>
+      </w:pPr>
+      <w:r>
+        <w:rPr>
+          <w:rFonts w:hint="default"/>
+          <w:lang w:val="es-CO"/>
+        </w:rPr>
+        <w:t>Cero redundancias y mayor orden</w:t>
+      </w:r>
+    </w:p>
+    <w:p>
+      <w:pPr>
+        <w:keepNext w:val="0"/>
+        <w:keepLines w:val="0"/>
+        <w:pageBreakBefore w:val="0"/>
+        <w:widowControl/>
+        <w:kinsoku/>
+        <w:wordWrap/>
+        <w:overflowPunct/>
+        <w:topLinePunct w:val="0"/>
+        <w:autoSpaceDE/>
+        <w:autoSpaceDN/>
+        <w:bidi w:val="0"/>
+        <w:adjustRightInd/>
+        <w:snapToGrid/>
+        <w:ind w:firstLine="720"/>
+        <w:textAlignment w:val="auto"/>
+        <w:rPr>
+          <w:rFonts w:hint="default"/>
+          <w:lang w:val="es-CO"/>
+        </w:rPr>
+      </w:pPr>
+    </w:p>
+    <w:p>
+      <w:pPr>
+        <w:keepNext w:val="0"/>
+        <w:keepLines w:val="0"/>
+        <w:pageBreakBefore w:val="0"/>
+        <w:widowControl/>
+        <w:kinsoku/>
+        <w:wordWrap/>
+        <w:overflowPunct/>
+        <w:topLinePunct w:val="0"/>
+        <w:autoSpaceDE/>
+        <w:autoSpaceDN/>
+        <w:bidi w:val="0"/>
+        <w:adjustRightInd/>
+        <w:snapToGrid/>
+        <w:ind w:firstLine="720"/>
+        <w:textAlignment w:val="auto"/>
+        <w:rPr>
+          <w:rFonts w:hint="default"/>
+          <w:lang w:val="es-CO"/>
+        </w:rPr>
+      </w:pPr>
+      <w:r>
+        <w:rPr>
+          <w:rFonts w:hint="default"/>
+          <w:lang w:val="es-CO"/>
+        </w:rPr>
+        <w:t>Gracias a una buena estructuración y normalización de la base de datos, se logró eliminar por completo la repetición innecesaria de información, evitando así posibles errores o inconsistencias al momento de actualizar los registros.</w:t>
+      </w:r>
+    </w:p>
+    <w:p>
+      <w:pPr>
+        <w:keepNext w:val="0"/>
+        <w:keepLines w:val="0"/>
+        <w:pageBreakBefore w:val="0"/>
+        <w:widowControl/>
+        <w:kinsoku/>
+        <w:wordWrap/>
+        <w:overflowPunct/>
+        <w:topLinePunct w:val="0"/>
+        <w:autoSpaceDE/>
+        <w:autoSpaceDN/>
+        <w:bidi w:val="0"/>
+        <w:adjustRightInd/>
+        <w:snapToGrid/>
+        <w:ind w:firstLine="720"/>
+        <w:textAlignment w:val="auto"/>
+        <w:rPr>
+          <w:rFonts w:hint="default"/>
+          <w:lang w:val="es-CO"/>
+        </w:rPr>
+      </w:pPr>
+    </w:p>
+    <w:p>
+      <w:pPr>
+        <w:keepNext w:val="0"/>
+        <w:keepLines w:val="0"/>
+        <w:pageBreakBefore w:val="0"/>
+        <w:widowControl/>
+        <w:numPr>
+          <w:ilvl w:val="0"/>
+          <w:numId w:val="4"/>
+        </w:numPr>
+        <w:kinsoku/>
+        <w:wordWrap/>
+        <w:overflowPunct/>
+        <w:topLinePunct w:val="0"/>
+        <w:autoSpaceDE/>
+        <w:autoSpaceDN/>
+        <w:bidi w:val="0"/>
+        <w:adjustRightInd/>
+        <w:snapToGrid/>
+        <w:ind w:left="425" w:leftChars="0" w:firstLine="720" w:firstLineChars="0"/>
+        <w:textAlignment w:val="auto"/>
+        <w:rPr>
+          <w:rFonts w:hint="default"/>
+          <w:lang w:val="es-CO"/>
+        </w:rPr>
+      </w:pPr>
+      <w:r>
+        <w:rPr>
+          <w:rFonts w:hint="default"/>
+          <w:lang w:val="es-CO"/>
+        </w:rPr>
+        <w:t>Búsquedas mucho más flexibles e inteligentes</w:t>
+      </w:r>
+    </w:p>
+    <w:p>
+      <w:pPr>
+        <w:keepNext w:val="0"/>
+        <w:keepLines w:val="0"/>
+        <w:pageBreakBefore w:val="0"/>
+        <w:widowControl/>
+        <w:kinsoku/>
+        <w:wordWrap/>
+        <w:overflowPunct/>
+        <w:topLinePunct w:val="0"/>
+        <w:autoSpaceDE/>
+        <w:autoSpaceDN/>
+        <w:bidi w:val="0"/>
+        <w:adjustRightInd/>
+        <w:snapToGrid/>
+        <w:ind w:firstLine="720"/>
+        <w:textAlignment w:val="auto"/>
+        <w:rPr>
+          <w:rFonts w:hint="default"/>
+          <w:lang w:val="es-CO"/>
+        </w:rPr>
+      </w:pPr>
+      <w:bookmarkStart w:id="10" w:name="_GoBack"/>
+      <w:bookmarkEnd w:id="10"/>
+    </w:p>
+    <w:p>
+      <w:pPr>
+        <w:keepNext w:val="0"/>
+        <w:keepLines w:val="0"/>
+        <w:pageBreakBefore w:val="0"/>
+        <w:widowControl/>
+        <w:kinsoku/>
+        <w:wordWrap/>
+        <w:overflowPunct/>
+        <w:topLinePunct w:val="0"/>
+        <w:autoSpaceDE/>
+        <w:autoSpaceDN/>
+        <w:bidi w:val="0"/>
+        <w:adjustRightInd/>
+        <w:snapToGrid/>
+        <w:ind w:firstLine="720"/>
+        <w:textAlignment w:val="auto"/>
+        <w:rPr>
+          <w:rFonts w:hint="default"/>
+          <w:lang w:val="es-CO"/>
+        </w:rPr>
+      </w:pPr>
+      <w:r>
+        <w:rPr>
+          <w:rFonts w:hint="default"/>
+          <w:lang w:val="es-CO"/>
+        </w:rPr>
+        <w:t>El sistema cuenta con una tabla especial dedicada a sinónimos que facilita interpretar distintas marcas y términos cotidianos que usan los usuarios, logrando conectar de forma correcta lo que escriben con los ingredientes oficiales.</w:t>
+      </w:r>
+    </w:p>
+    <w:p>
+      <w:pPr>
+        <w:keepNext w:val="0"/>
+        <w:keepLines w:val="0"/>
+        <w:pageBreakBefore w:val="0"/>
+        <w:widowControl/>
+        <w:kinsoku/>
+        <w:wordWrap/>
+        <w:overflowPunct/>
+        <w:topLinePunct w:val="0"/>
+        <w:autoSpaceDE/>
+        <w:autoSpaceDN/>
+        <w:bidi w:val="0"/>
+        <w:adjustRightInd/>
+        <w:snapToGrid/>
+        <w:ind w:firstLine="720"/>
+        <w:textAlignment w:val="auto"/>
+        <w:rPr>
+          <w:rFonts w:hint="default"/>
+          <w:lang w:val="es-CO"/>
+        </w:rPr>
+      </w:pPr>
+    </w:p>
+    <w:p>
+      <w:pPr>
+        <w:keepNext w:val="0"/>
+        <w:keepLines w:val="0"/>
+        <w:pageBreakBefore w:val="0"/>
+        <w:widowControl/>
+        <w:numPr>
+          <w:ilvl w:val="0"/>
+          <w:numId w:val="4"/>
+        </w:numPr>
+        <w:kinsoku/>
+        <w:wordWrap/>
+        <w:overflowPunct/>
+        <w:topLinePunct w:val="0"/>
+        <w:autoSpaceDE/>
+        <w:autoSpaceDN/>
+        <w:bidi w:val="0"/>
+        <w:adjustRightInd/>
+        <w:snapToGrid/>
+        <w:ind w:left="425" w:leftChars="0" w:firstLine="720" w:firstLineChars="0"/>
+        <w:textAlignment w:val="auto"/>
+        <w:rPr>
+          <w:rFonts w:hint="default"/>
+          <w:lang w:val="es-CO"/>
+        </w:rPr>
+      </w:pPr>
+      <w:r>
+        <w:rPr>
+          <w:rFonts w:hint="default"/>
+          <w:lang w:val="es-CO"/>
+        </w:rPr>
+        <w:t>Sugerencias generadas al instante</w:t>
+      </w:r>
+    </w:p>
+    <w:p>
+      <w:pPr>
+        <w:keepNext w:val="0"/>
+        <w:keepLines w:val="0"/>
+        <w:pageBreakBefore w:val="0"/>
+        <w:widowControl/>
+        <w:kinsoku/>
+        <w:wordWrap/>
+        <w:overflowPunct/>
+        <w:topLinePunct w:val="0"/>
+        <w:autoSpaceDE/>
+        <w:autoSpaceDN/>
+        <w:bidi w:val="0"/>
+        <w:adjustRightInd/>
+        <w:snapToGrid/>
+        <w:ind w:firstLine="720"/>
+        <w:textAlignment w:val="auto"/>
+        <w:rPr>
+          <w:rFonts w:hint="default"/>
+          <w:lang w:val="es-CO"/>
+        </w:rPr>
+      </w:pPr>
+    </w:p>
+    <w:p>
+      <w:pPr>
+        <w:keepNext w:val="0"/>
+        <w:keepLines w:val="0"/>
+        <w:pageBreakBefore w:val="0"/>
+        <w:widowControl/>
+        <w:kinsoku/>
+        <w:wordWrap/>
+        <w:overflowPunct/>
+        <w:topLinePunct w:val="0"/>
+        <w:autoSpaceDE/>
+        <w:autoSpaceDN/>
+        <w:bidi w:val="0"/>
+        <w:adjustRightInd/>
+        <w:snapToGrid/>
+        <w:ind w:firstLine="720"/>
+        <w:textAlignment w:val="auto"/>
+        <w:rPr>
+          <w:rFonts w:hint="default"/>
+          <w:lang w:val="es-CO"/>
+        </w:rPr>
+      </w:pPr>
+      <w:r>
+        <w:rPr>
+          <w:rFonts w:hint="default"/>
+          <w:lang w:val="es-CO"/>
+        </w:rPr>
+        <w:t>Las recomendaciones de recetas no se guardan de forma estática en el sistema; por el contrario, el motor calcula las coincidencias en tiempo real comparando lo que cada usuario tiene registrado en su despensa con las opciones disponibles.</w:t>
+      </w:r>
+    </w:p>
+    <w:p>
+      <w:pPr>
+        <w:keepNext w:val="0"/>
+        <w:keepLines w:val="0"/>
+        <w:pageBreakBefore w:val="0"/>
+        <w:widowControl/>
+        <w:kinsoku/>
+        <w:wordWrap/>
+        <w:overflowPunct/>
+        <w:topLinePunct w:val="0"/>
+        <w:autoSpaceDE/>
+        <w:autoSpaceDN/>
+        <w:bidi w:val="0"/>
+        <w:adjustRightInd/>
+        <w:snapToGrid/>
+        <w:ind w:firstLine="720"/>
+        <w:textAlignment w:val="auto"/>
+        <w:rPr>
+          <w:rFonts w:hint="default"/>
+          <w:lang w:val="es-CO"/>
+        </w:rPr>
+      </w:pPr>
+    </w:p>
+    <w:p>
+      <w:pPr>
+        <w:keepNext w:val="0"/>
+        <w:keepLines w:val="0"/>
+        <w:pageBreakBefore w:val="0"/>
+        <w:widowControl/>
+        <w:numPr>
+          <w:ilvl w:val="0"/>
+          <w:numId w:val="4"/>
+        </w:numPr>
+        <w:kinsoku/>
+        <w:wordWrap/>
+        <w:overflowPunct/>
+        <w:topLinePunct w:val="0"/>
+        <w:autoSpaceDE/>
+        <w:autoSpaceDN/>
+        <w:bidi w:val="0"/>
+        <w:adjustRightInd/>
+        <w:snapToGrid/>
+        <w:ind w:left="425" w:leftChars="0" w:firstLine="720" w:firstLineChars="0"/>
+        <w:textAlignment w:val="auto"/>
+        <w:rPr>
+          <w:rFonts w:hint="default"/>
+          <w:lang w:val="es-CO"/>
+        </w:rPr>
+      </w:pPr>
+      <w:r>
+        <w:rPr>
+          <w:rFonts w:hint="default"/>
+          <w:lang w:val="es-CO"/>
+        </w:rPr>
+        <w:t>Seguimiento detallado de la actividad</w:t>
+      </w:r>
+    </w:p>
+    <w:p>
+      <w:pPr>
+        <w:keepNext w:val="0"/>
+        <w:keepLines w:val="0"/>
+        <w:pageBreakBefore w:val="0"/>
+        <w:widowControl/>
+        <w:kinsoku/>
+        <w:wordWrap/>
+        <w:overflowPunct/>
+        <w:topLinePunct w:val="0"/>
+        <w:autoSpaceDE/>
+        <w:autoSpaceDN/>
+        <w:bidi w:val="0"/>
+        <w:adjustRightInd/>
+        <w:snapToGrid/>
+        <w:ind w:firstLine="720"/>
+        <w:textAlignment w:val="auto"/>
+        <w:rPr>
+          <w:rFonts w:hint="default"/>
+          <w:lang w:val="es-CO"/>
+        </w:rPr>
+      </w:pPr>
+    </w:p>
+    <w:p>
+      <w:pPr>
+        <w:keepNext w:val="0"/>
+        <w:keepLines w:val="0"/>
+        <w:pageBreakBefore w:val="0"/>
+        <w:widowControl/>
+        <w:kinsoku/>
+        <w:wordWrap/>
+        <w:overflowPunct/>
+        <w:topLinePunct w:val="0"/>
+        <w:autoSpaceDE/>
+        <w:autoSpaceDN/>
+        <w:bidi w:val="0"/>
+        <w:adjustRightInd/>
+        <w:snapToGrid/>
+        <w:ind w:firstLine="720"/>
+        <w:textAlignment w:val="auto"/>
+        <w:rPr>
+          <w:rFonts w:hint="default"/>
+          <w:lang w:val="es-CO"/>
+        </w:rPr>
+      </w:pPr>
+      <w:r>
+        <w:rPr>
+          <w:rFonts w:hint="default"/>
+          <w:lang w:val="es-CO"/>
+        </w:rPr>
+        <w:t>Se incorporó un registro cronológico del historial de búsquedas para cada usuario, lo que permite conservar la trazabilidad de sus consultas y abre la puerta a futuros análisis analíticos.</w:t>
+      </w:r>
+    </w:p>
+    <w:p>
+      <w:pPr>
+        <w:keepNext w:val="0"/>
+        <w:keepLines w:val="0"/>
+        <w:pageBreakBefore w:val="0"/>
+        <w:widowControl/>
+        <w:kinsoku/>
+        <w:wordWrap/>
+        <w:overflowPunct/>
+        <w:topLinePunct w:val="0"/>
+        <w:autoSpaceDE/>
+        <w:autoSpaceDN/>
+        <w:bidi w:val="0"/>
+        <w:adjustRightInd/>
+        <w:snapToGrid/>
+        <w:ind w:firstLine="720"/>
+        <w:textAlignment w:val="auto"/>
+        <w:rPr>
+          <w:rFonts w:hint="default"/>
+          <w:lang w:val="es-CO"/>
+        </w:rPr>
+      </w:pPr>
+    </w:p>
+    <w:p>
+      <w:pPr>
+        <w:keepNext w:val="0"/>
+        <w:keepLines w:val="0"/>
+        <w:pageBreakBefore w:val="0"/>
+        <w:widowControl/>
+        <w:numPr>
+          <w:ilvl w:val="0"/>
+          <w:numId w:val="4"/>
+        </w:numPr>
+        <w:kinsoku/>
+        <w:wordWrap/>
+        <w:overflowPunct/>
+        <w:topLinePunct w:val="0"/>
+        <w:autoSpaceDE/>
+        <w:autoSpaceDN/>
+        <w:bidi w:val="0"/>
+        <w:adjustRightInd/>
+        <w:snapToGrid/>
+        <w:ind w:left="425" w:leftChars="0" w:firstLine="720" w:firstLineChars="0"/>
+        <w:textAlignment w:val="auto"/>
+        <w:rPr>
+          <w:rFonts w:hint="default"/>
+          <w:lang w:val="es-CO"/>
+        </w:rPr>
+      </w:pPr>
+      <w:r>
+        <w:rPr>
+          <w:rFonts w:hint="default"/>
+          <w:lang w:val="es-CO"/>
+        </w:rPr>
+        <w:t>Integración armónica con el ecosistema general</w:t>
+      </w:r>
+    </w:p>
+    <w:p>
+      <w:pPr>
+        <w:keepNext w:val="0"/>
+        <w:keepLines w:val="0"/>
+        <w:pageBreakBefore w:val="0"/>
+        <w:widowControl/>
+        <w:kinsoku/>
+        <w:wordWrap/>
+        <w:overflowPunct/>
+        <w:topLinePunct w:val="0"/>
+        <w:autoSpaceDE/>
+        <w:autoSpaceDN/>
+        <w:bidi w:val="0"/>
+        <w:adjustRightInd/>
+        <w:snapToGrid/>
+        <w:ind w:firstLine="720"/>
+        <w:textAlignment w:val="auto"/>
+        <w:rPr>
+          <w:rFonts w:hint="default"/>
+          <w:lang w:val="es-CO"/>
+        </w:rPr>
+      </w:pPr>
+    </w:p>
+    <w:p>
+      <w:pPr>
+        <w:keepNext w:val="0"/>
+        <w:keepLines w:val="0"/>
+        <w:pageBreakBefore w:val="0"/>
+        <w:widowControl/>
+        <w:kinsoku/>
+        <w:wordWrap/>
+        <w:overflowPunct/>
+        <w:topLinePunct w:val="0"/>
+        <w:autoSpaceDE/>
+        <w:autoSpaceDN/>
+        <w:bidi w:val="0"/>
+        <w:adjustRightInd/>
+        <w:snapToGrid/>
+        <w:ind w:firstLine="720"/>
+        <w:textAlignment w:val="auto"/>
+        <w:rPr>
+          <w:rFonts w:hint="default"/>
+          <w:lang w:val="es-CO"/>
+        </w:rPr>
+      </w:pPr>
+      <w:r>
+        <w:rPr>
+          <w:rFonts w:hint="default"/>
+          <w:lang w:val="es-CO"/>
+        </w:rPr>
+        <w:t>El diseño desarrollado encaja de manera fluida dentro de la arquitectura más amplia del proyecto. Sazón para Grupo Nutresa, integrando de forma eficiente tablas y componentes provenientes de diferentes equipos de trabajo.</w:t>
+      </w:r>
+    </w:p>
+    <w:p>
+      <w:pPr>
+        <w:rPr>
+          <w:rFonts w:hint="default"/>
+          <w:lang w:val="es-CO"/>
+        </w:rPr>
+      </w:pPr>
       <w:r>
         <w:rPr>
           <w:rFonts w:hint="default"/>
@@ -3692,7 +4251,7 @@
           <w:lang w:val="es-CO"/>
         </w:rPr>
       </w:pPr>
-      <w:bookmarkStart w:id="8" w:name="_Toc3923"/>
+      <w:bookmarkStart w:id="8" w:name="_Toc9485"/>
       <w:r>
         <w:rPr>
           <w:rFonts w:hint="default"/>
@@ -4206,7 +4765,7 @@
           <w:lang w:val="es-CO"/>
         </w:rPr>
       </w:pPr>
-      <w:bookmarkStart w:id="9" w:name="_Toc18492"/>
+      <w:bookmarkStart w:id="9" w:name="_Toc4421"/>
       <w:r>
         <w:rPr>
           <w:rFonts w:hint="default"/>
@@ -4393,6 +4952,26 @@
     </w:lvl>
   </w:abstractNum>
   <w:abstractNum w:abstractNumId="2">
+    <w:nsid w:val="D1F5AF1B"/>
+    <w:multiLevelType w:val="singleLevel"/>
+    <w:tmpl w:val="D1F5AF1B"/>
+    <w:lvl w:ilvl="0" w:tentative="0">
+      <w:start w:val="1"/>
+      <w:numFmt w:val="decimal"/>
+      <w:lvlText w:val="%1."/>
+      <w:lvlJc w:val="left"/>
+      <w:pPr>
+        <w:tabs>
+          <w:tab w:val="left" w:pos="425"/>
+        </w:tabs>
+        <w:ind w:left="425" w:leftChars="0" w:hanging="425" w:firstLineChars="0"/>
+      </w:pPr>
+      <w:rPr>
+        <w:rFonts w:hint="default"/>
+      </w:rPr>
+    </w:lvl>
+  </w:abstractNum>
+  <w:abstractNum w:abstractNumId="3">
     <w:nsid w:val="61C8E41C"/>
     <w:multiLevelType w:val="singleLevel"/>
     <w:tmpl w:val="61C8E41C"/>
@@ -4416,10 +4995,13 @@
     <w:abstractNumId w:val="1"/>
   </w:num>
   <w:num w:numId="2">
-    <w:abstractNumId w:val="2"/>
+    <w:abstractNumId w:val="3"/>
   </w:num>
   <w:num w:numId="3">
     <w:abstractNumId w:val="0"/>
+  </w:num>
+  <w:num w:numId="4">
+    <w:abstractNumId w:val="2"/>
   </w:num>
 </w:numbering>
 </file>
@@ -4527,7 +5109,7 @@
     <w:lsdException w:unhideWhenUsed="0" w:uiPriority="0" w:semiHidden="0" w:name="Document Map"/>
     <w:lsdException w:unhideWhenUsed="0" w:uiPriority="0" w:semiHidden="0" w:name="Plain Text"/>
     <w:lsdException w:unhideWhenUsed="0" w:uiPriority="0" w:semiHidden="0" w:name="E-mail Signature"/>
-    <w:lsdException w:unhideWhenUsed="0" w:uiPriority="0" w:semiHidden="0" w:name="Normal (Web)"/>
+    <w:lsdException w:qFormat="1" w:unhideWhenUsed="0" w:uiPriority="0" w:semiHidden="0" w:name="Normal (Web)"/>
     <w:lsdException w:unhideWhenUsed="0" w:uiPriority="0" w:semiHidden="0" w:name="HTML Acronym"/>
     <w:lsdException w:unhideWhenUsed="0" w:uiPriority="0" w:semiHidden="0" w:name="HTML Address"/>
     <w:lsdException w:unhideWhenUsed="0" w:uiPriority="0" w:semiHidden="0" w:name="HTML Cite"/>
@@ -4686,6 +5268,7 @@
   </w:style>
   <w:style w:type="paragraph" w:styleId="8">
     <w:name w:val="Normal (Web)"/>
+    <w:qFormat/>
     <w:uiPriority w:val="0"/>
     <w:pPr>
       <w:spacing w:before="0" w:beforeAutospacing="1" w:after="0" w:afterAutospacing="1"/>
@@ -4693,6 +5276,7 @@
       <w:jc w:val="left"/>
     </w:pPr>
     <w:rPr>
+      <w:rFonts w:ascii="Times New Roman" w:hAnsi="Times New Roman" w:eastAsia="SimSun" w:cs="Times New Roman"/>
       <w:kern w:val="0"/>
       <w:sz w:val="24"/>
       <w:szCs w:val="24"/>

</xml_diff>